<commit_message>
email update, docs updates
</commit_message>
<xml_diff>
--- a/assets/docs/TYLER_HISLOP_RESUME_25.docx
+++ b/assets/docs/TYLER_HISLOP_RESUME_25.docx
@@ -94,6 +94,7 @@
         <w:rPr>
           <w:rFonts w:ascii="Raleway" w:eastAsia="Raleway" w:hAnsi="Raleway" w:cs="Raleway"/>
           <w:b/>
+          <w:bCs/>
           <w:sz w:val="17"/>
           <w:szCs w:val="17"/>
         </w:rPr>
@@ -111,12 +112,13 @@
         <w:r>
           <w:rPr>
             <w:rStyle w:val="Hyperlink"/>
-            <w:rFonts w:ascii="Raleway" w:eastAsia="Raleway" w:hAnsi="Raleway" w:cs="Raleway"/>
+            <w:rFonts w:ascii="Raleway" w:hAnsi="Raleway"/>
             <w:b/>
+            <w:bCs/>
             <w:sz w:val="17"/>
             <w:szCs w:val="17"/>
           </w:rPr>
-          <w:t>trdataprojects@gmail.com</w:t>
+          <w:t>hislop.tyler@gmail.com</w:t>
         </w:r>
       </w:hyperlink>
     </w:p>
@@ -1335,18 +1337,8 @@
           <w:sz w:val="18"/>
           <w:szCs w:val="18"/>
         </w:rPr>
-        <w:t xml:space="preserve">, GIS-T and AK </w:t>
-      </w:r>
-      <w:proofErr w:type="spellStart"/>
-      <w:r>
-        <w:rPr>
-          <w:rFonts w:ascii="Raleway" w:eastAsia="Raleway" w:hAnsi="Raleway" w:cs="Raleway"/>
-          <w:sz w:val="18"/>
-          <w:szCs w:val="18"/>
-        </w:rPr>
-        <w:t>Geosummit</w:t>
-      </w:r>
-      <w:proofErr w:type="spellEnd"/>
+        <w:t>, GIS-T and AK Geosummit</w:t>
+      </w:r>
     </w:p>
     <w:p>
       <w:pPr>
@@ -1717,25 +1709,7 @@
           <w:sz w:val="17"/>
           <w:szCs w:val="17"/>
         </w:rPr>
-        <w:t xml:space="preserve">Collects and </w:t>
-      </w:r>
-      <w:proofErr w:type="gramStart"/>
-      <w:r>
-        <w:rPr>
-          <w:rFonts w:ascii="Raleway" w:eastAsia="Raleway" w:hAnsi="Raleway" w:cs="Raleway"/>
-          <w:sz w:val="17"/>
-          <w:szCs w:val="17"/>
-        </w:rPr>
-        <w:t>curates</w:t>
-      </w:r>
-      <w:proofErr w:type="gramEnd"/>
-      <w:r>
-        <w:rPr>
-          <w:rFonts w:ascii="Raleway" w:eastAsia="Raleway" w:hAnsi="Raleway" w:cs="Raleway"/>
-          <w:sz w:val="17"/>
-          <w:szCs w:val="17"/>
-        </w:rPr>
-        <w:t xml:space="preserve"> information regarding extent, condition, performance, use, and operating characteristics of roadways</w:t>
+        <w:t>Collects and curates information regarding extent, condition, performance, use, and operating characteristics of roadways</w:t>
       </w:r>
     </w:p>
     <w:p>

</xml_diff>